<commit_message>
chore: regenera el reporte con el estado actual del repositorio
</commit_message>
<xml_diff>
--- a/docs/entregas/Entrega-1-reporte.docx
+++ b/docs/entregas/Entrega-1-reporte.docx
@@ -595,7 +595,7 @@
           <w:sz w:val="17"/>
         </w:rPr>
         <w:br/>
-        <w:t xml:space="preserve">  14</w:t>
+        <w:t xml:space="preserve">  16</w:t>
         <w:tab/>
         <w:t>katterine2558 &lt;61667956+katterine2558@users.noreply.github.com&gt;</w:t>
       </w:r>
@@ -614,7 +614,7 @@
           <w:sz w:val="17"/>
         </w:rPr>
         <w:br/>
-        <w:t>$ git log --oneline --all | wc -l      →  14 commits</w:t>
+        <w:t>$ git log --oneline --all | wc -l      →  16 commits</w:t>
       </w:r>
       <w:r>
         <w:rPr>

</xml_diff>

<commit_message>
fix: corrige el conteo de reingresos tempranos en hospicio
El generador del diccionario contaba readmitted != 'NO', es decir cualquier
reingreso, cuando la variable objetivo es solo el reingreso antes de 30 dias.
De ahi salia la cifra de 86 casos, que son 43 tempranos mas 43 tardios.

Los pacientes con egreso a hospicio que reingresan antes de 30 dias son 43,
una tasa de 5,58 % frente al 11,39 % general. El diccionario y el reporte se
regeneran con la cifra corregida.
</commit_message>
<xml_diff>
--- a/docs/entregas/Entrega-1-reporte.docx
+++ b/docs/entregas/Entrega-1-reporte.docx
@@ -595,7 +595,7 @@
           <w:sz w:val="17"/>
         </w:rPr>
         <w:br/>
-        <w:t xml:space="preserve">  16</w:t>
+        <w:t xml:space="preserve">  23</w:t>
         <w:tab/>
         <w:t>katterine2558 &lt;61667956+katterine2558@users.noreply.github.com&gt;</w:t>
       </w:r>
@@ -614,7 +614,7 @@
           <w:sz w:val="17"/>
         </w:rPr>
         <w:br/>
-        <w:t>$ git log --oneline --all | wc -l      →  16 commits</w:t>
+        <w:t>$ git log --oneline --all | wc -l      →  23 commits</w:t>
       </w:r>
       <w:r>
         <w:rPr>
@@ -623,7 +623,7 @@
           <w:sz w:val="17"/>
         </w:rPr>
         <w:br/>
-        <w:t>$ git branch                           →  develop, feature/estructura-proyecto, feature/exploracion-datos, main</w:t>
+        <w:t>$ git branch                           →  develop, feature/exploracion-datos, main</w:t>
       </w:r>
     </w:p>
     <w:p>
@@ -1212,7 +1212,7 @@
           <w:b w:val="0"/>
           <w:i w:val="0"/>
         </w:rPr>
-        <w:t>El destino al egreso identifica encuentros que no deben entrar al análisis, por razones que conviene no confundir. Los 1 652 encuentros de pacientes fallecidos no pueden reingresar, y los datos lo confirman: ninguno registra reingreso. Excluirlos corrige un imposible. Los 771 con egreso a hospicio sí reingresan —hay 86 casos— y se excluyen por una razón distinta: son pacientes en cuidado de fin de vida, donde agendar un control para evitar el reingreso no es la intervención que el tablero decide.</w:t>
+        <w:t>El destino al egreso identifica encuentros que no deben entrar al análisis, por razones que conviene no confundir. Los 1 652 encuentros de pacientes fallecidos no pueden reingresar, y los datos lo confirman: ninguno registra reingreso. Excluirlos corrige un imposible. Los 771 con egreso a hospicio sí reingresan —43 lo hacen antes de los 30 días— y se excluyen por una razón distinta: son pacientes en cuidado de fin de vida, donde agendar un control para evitar el reingreso no es la intervención que el tablero decide.</w:t>
       </w:r>
     </w:p>
     <w:p>

</xml_diff>

<commit_message>
docs: enlaza cada soporte por URL y agrega los integrantes
El remoto DVC seguia declarado como s3://maia-pds-diabetes-dvc, el bucket de
AWS Academy que quedo inaccesible. Se actualiza al bucket vigente.

Los soportes se citaban por ruta de archivo. Ahora cada uno lleva su URL, y se
agregan el conjunto de datos original, el notebook de exploracion y la politica
IAM del remoto, que antes no figuraban.
</commit_message>
<xml_diff>
--- a/docs/entregas/Entrega-1-reporte.docx
+++ b/docs/entregas/Entrega-1-reporte.docx
@@ -46,16 +46,16 @@
     </w:p>
     <w:p>
       <w:pPr>
-        <w:ind w:left="227"/>
+        <w:jc w:val="left"/>
       </w:pPr>
       <w:r>
         <w:rPr>
           <w:b w:val="0"/>
-          <w:i/>
-          <w:color w:val="993300"/>
+          <w:i w:val="0"/>
+          <w:color w:val="595959"/>
           <w:sz w:val="20"/>
         </w:rPr>
-        <w:t>PENDIENTE — integrantes del equipo (nombres y códigos). Va aquí, en una sola línea.</w:t>
+        <w:t>Camilo Andrés Rodríguez Dueñas · Jasbyn Rainier Solano Carrillo · Leonardo Almanza Sánchez · Gineth Katerine Arias Carrillo</w:t>
       </w:r>
     </w:p>
     <w:p>
@@ -595,7 +595,7 @@
           <w:sz w:val="17"/>
         </w:rPr>
         <w:br/>
-        <w:t xml:space="preserve">  23</w:t>
+        <w:t xml:space="preserve">  29</w:t>
         <w:tab/>
         <w:t>katterine2558 &lt;61667956+katterine2558@users.noreply.github.com&gt;</w:t>
       </w:r>
@@ -614,7 +614,7 @@
           <w:sz w:val="17"/>
         </w:rPr>
         <w:br/>
-        <w:t>$ git log --oneline --all | wc -l      →  23 commits</w:t>
+        <w:t>$ git log --oneline --all | wc -l      →  29 commits</w:t>
       </w:r>
       <w:r>
         <w:rPr>
@@ -623,7 +623,7 @@
           <w:sz w:val="17"/>
         </w:rPr>
         <w:br/>
-        <w:t>$ git branch                           →  develop, feature/exploracion-datos, main</w:t>
+        <w:t>$ git branch                           →  develop, feature/exploracion-datos, feature/reporte-urls, main</w:t>
       </w:r>
     </w:p>
     <w:p>
@@ -668,7 +668,7 @@
           <w:b w:val="0"/>
           <w:i w:val="0"/>
         </w:rPr>
-        <w:t>Los datos se versionan con DVC sobre el mismo repositorio de Git. En Git viaja únicamente el puntero data/raw.dvc —cinco líneas de texto— mientras que los archivos reales, 18 MB, viven en el remoto s3://maia-pds-diabetes-dvc. La separación es explícita en el .gitignore: el contenido de data/ está excluido y solo se permiten los punteros .dvc.</w:t>
+        <w:t>Los datos se versionan con DVC sobre el mismo repositorio de Git. En Git viaja únicamente el puntero data/raw.dvc —cinco líneas de texto— mientras que los archivos reales, 18 MB, viven en el remoto s3://maia-pds-diabetes-dvc-982005835034. La separación es explícita en el .gitignore: el contenido de data/ está excluido y solo se permiten los punteros .dvc.</w:t>
       </w:r>
     </w:p>
     <w:p>
@@ -2514,7 +2514,7 @@
           <w:b w:val="0"/>
           <w:i w:val="0"/>
         </w:rPr>
-        <w:t>Repositorio: https://github.com/katterine2558/microproyecto-desarrollo-soluciones (código, historial de commits y ramas)</w:t>
+        <w:t>Repositorio, con el historial de commits y las ramas: https://github.com/katterine2558/microproyecto-desarrollo-soluciones</w:t>
       </w:r>
     </w:p>
     <w:p>
@@ -2526,7 +2526,7 @@
           <w:b w:val="0"/>
           <w:i w:val="0"/>
         </w:rPr>
-        <w:t>Diccionario completo de las 50 variables: docs/diccionario-variables.md</w:t>
+        <w:t>Conjunto de datos original, UCI 296, licencia CC BY 4.0: https://archive.ics.uci.edu/dataset/296/diabetes+130-us+hospitals+for+years+1999-2008</w:t>
       </w:r>
     </w:p>
     <w:p>
@@ -2538,7 +2538,7 @@
           <w:b w:val="0"/>
           <w:i w:val="0"/>
         </w:rPr>
-        <w:t>Huellas SHA-256 y URL de descarga: docs/soportes/checksums-datos-crudos.txt</w:t>
+        <w:t>Remoto DVC de los datos, lectura pública: s3://maia-pds-diabetes-dvc-982005835034</w:t>
       </w:r>
     </w:p>
     <w:p>
@@ -2550,7 +2550,7 @@
           <w:b w:val="0"/>
           <w:i w:val="0"/>
         </w:rPr>
-        <w:t>Maqueta navegable: docs/maqueta/pantallas.html y docs/maqueta/memoria.html</w:t>
+        <w:t>Notebook de exploración, nueve secciones ejecutadas: https://github.com/katterine2558/microproyecto-desarrollo-soluciones/blob/main/notebooks/eda.ipynb</w:t>
       </w:r>
     </w:p>
     <w:p>
@@ -2562,7 +2562,67 @@
           <w:b w:val="0"/>
           <w:i w:val="0"/>
         </w:rPr>
-        <w:t>Figuras de la exploración en resolución completa: docs/entregas/figuras/</w:t>
+        <w:t>Diccionario de las 50 variables: https://github.com/katterine2558/microproyecto-desarrollo-soluciones/blob/main/docs/diccionario-variables.md</w:t>
+      </w:r>
+    </w:p>
+    <w:p>
+      <w:pPr>
+        <w:pStyle w:val="ListBullet"/>
+      </w:pPr>
+      <w:r>
+        <w:rPr>
+          <w:b w:val="0"/>
+          <w:i w:val="0"/>
+        </w:rPr>
+        <w:t>Huellas SHA-256 y URL de descarga de los datos: https://github.com/katterine2558/microproyecto-desarrollo-soluciones/blob/main/docs/soportes/checksums-datos-crudos.txt</w:t>
+      </w:r>
+    </w:p>
+    <w:p>
+      <w:pPr>
+        <w:pStyle w:val="ListBullet"/>
+      </w:pPr>
+      <w:r>
+        <w:rPr>
+          <w:b w:val="0"/>
+          <w:i w:val="0"/>
+        </w:rPr>
+        <w:t>Maqueta, pantallas: https://github.com/katterine2558/microproyecto-desarrollo-soluciones/blob/main/docs/maqueta/pantallas.html</w:t>
+      </w:r>
+    </w:p>
+    <w:p>
+      <w:pPr>
+        <w:pStyle w:val="ListBullet"/>
+      </w:pPr>
+      <w:r>
+        <w:rPr>
+          <w:b w:val="0"/>
+          <w:i w:val="0"/>
+        </w:rPr>
+        <w:t>Maqueta, memoria de los trece elementos: https://github.com/katterine2558/microproyecto-desarrollo-soluciones/blob/main/docs/maqueta/memoria.html</w:t>
+      </w:r>
+    </w:p>
+    <w:p>
+      <w:pPr>
+        <w:pStyle w:val="ListBullet"/>
+      </w:pPr>
+      <w:r>
+        <w:rPr>
+          <w:b w:val="0"/>
+          <w:i w:val="0"/>
+        </w:rPr>
+        <w:t>Figuras en resolución completa: https://github.com/katterine2558/microproyecto-desarrollo-soluciones/tree/main/docs/entregas/figuras</w:t>
+      </w:r>
+    </w:p>
+    <w:p>
+      <w:pPr>
+        <w:pStyle w:val="ListBullet"/>
+      </w:pPr>
+      <w:r>
+        <w:rPr>
+          <w:b w:val="0"/>
+          <w:i w:val="0"/>
+        </w:rPr>
+        <w:t>Política IAM del remoto de datos: https://github.com/katterine2558/microproyecto-desarrollo-soluciones/blob/main/docs/soportes/politica-iam-dvc.json</w:t>
       </w:r>
     </w:p>
     <w:sectPr>

</xml_diff>

<commit_message>
docs: registra en el reporte que el repositorio es publico
El punto 4 de la entrega exige un repositorio Git verificable. Al pasar el
repositorio a publico, el equipo de tutores puede revisar codigo, historial y
ramas sin solicitar acceso, asi que el bloque pendiente que advertia lo
contrario se reemplaza por la descripcion del esquema de contribucion: los
cuatro integrantes son colaboradores con permiso de escritura e integran por
merge directo a develop, mientras que cualquier persona externa solo puede
proponer cambios via fork y pull request. Ese es el comportamiento por defecto
de GitHub y no requiere reglas de proteccion de rama, que si se activaran
obligarian tambien al equipo a pasar por pull request.
</commit_message>
<xml_diff>
--- a/docs/entregas/Entrega-1-reporte.docx
+++ b/docs/entregas/Entrega-1-reporte.docx
@@ -595,7 +595,7 @@
           <w:sz w:val="17"/>
         </w:rPr>
         <w:br/>
-        <w:t xml:space="preserve">  29</w:t>
+        <w:t xml:space="preserve">  32</w:t>
         <w:tab/>
         <w:t>katterine2558 &lt;61667956+katterine2558@users.noreply.github.com&gt;</w:t>
       </w:r>
@@ -614,7 +614,7 @@
           <w:sz w:val="17"/>
         </w:rPr>
         <w:br/>
-        <w:t>$ git log --oneline --all | wc -l      →  29 commits</w:t>
+        <w:t>$ git log --oneline --all | wc -l      →  32 commits</w:t>
       </w:r>
       <w:r>
         <w:rPr>
@@ -623,7 +623,7 @@
           <w:sz w:val="17"/>
         </w:rPr>
         <w:br/>
-        <w:t>$ git branch                           →  develop, feature/exploracion-datos, feature/reporte-urls, main</w:t>
+        <w:t>$ git branch                           →  develop, feature/exploracion-datos, feature/repo-publico, feature/reporte-urls, main</w:t>
       </w:r>
     </w:p>
     <w:p>
@@ -641,17 +641,12 @@
       </w:r>
     </w:p>
     <w:p>
-      <w:pPr>
-        <w:ind w:left="227"/>
-      </w:pPr>
       <w:r>
         <w:rPr>
           <w:b w:val="0"/>
-          <w:i/>
-          <w:color w:val="993300"/>
-          <w:sz w:val="20"/>
+          <w:i w:val="0"/>
         </w:rPr>
-        <w:t>PENDIENTE — el repositorio está en modo privado. Hay que darle acceso al equipo de tutores o hacerlo público; si no, este punto no se puede verificar.</w:t>
+        <w:t>El repositorio es público, de modo que el equipo de tutores puede revisar el código, el historial y las ramas sin solicitar acceso. Los cuatro integrantes figuran como colaboradores con permiso de escritura e integran su trabajo mediante merges directos a develop; cualquier persona ajena al equipo solo puede proponer cambios vía fork y pull request, que es el comportamiento por defecto de GitHub y no requiere reglas de protección de rama.</w:t>
       </w:r>
     </w:p>
     <w:p>

</xml_diff>

<commit_message>
docs: actualiza reporte final de Entrega 1
</commit_message>
<xml_diff>
--- a/docs/entregas/Entrega-1-reporte.docx
+++ b/docs/entregas/Entrega-1-reporte.docx
@@ -72,7 +72,7 @@
           <w:b w:val="0"/>
           <w:i w:val="0"/>
         </w:rPr>
-        <w:t>Un reingreso hospitalario temprano —volver a ser hospitalizado dentro de los 30 días siguientes al alta— se considera un indicador de calidad de la transición del cuidado. Cuando un paciente vuelve tan pronto, lo habitual no es que haya aparecido una enfermedad nueva, sino que algo de la salida falló: la medicación quedó mal ajustada, el control no se agendó, o el paciente no entendió las indicaciones. En pacientes diabéticos el problema es particularmente marcado, porque el manejo posterior al alta exige seguimiento sostenido.</w:t>
+        <w:t>El reingreso hospitalario temprano —entendido en este proyecto como una nueva hospitalización dentro de los 30 días posteriores al alta— constituye el evento de interés porque representa una utilización repetida de servicios en un periodo corto y plantea una oportunidad de fortalecer el seguimiento posterior al egreso. En pacientes con diabetes, la necesidad de continuidad del cuidado es especialmente relevante por el carácter crónico de la enfermedad y por la coexistencia frecuente de múltiples diagnósticos, medicamentos y antecedentes de utilización hospitalaria. El propósito del proyecto no es atribuir una causa clínica al reingreso, sino identificar qué pacientes presentan mayor riesgo de volver al hospital en ese plazo.</w:t>
       </w:r>
     </w:p>
     <w:p>
@@ -81,21 +81,7 @@
           <w:b w:val="0"/>
           <w:i w:val="0"/>
         </w:rPr>
-        <w:t xml:space="preserve">La unidad de gestión hospitalaria puede intervenir antes de que el paciente salga: agendar un control temprano, ajustar la medicación, activar enfermería domiciliaria. El obstáculo no es saber qué hacer sino </w:t>
-      </w:r>
-      <w:r>
-        <w:rPr>
-          <w:b/>
-          <w:i w:val="0"/>
-        </w:rPr>
-        <w:t>a cuántos alcanza a hacérselo</w:t>
-      </w:r>
-      <w:r>
-        <w:rPr>
-          <w:b w:val="0"/>
-          <w:i w:val="0"/>
-        </w:rPr>
-        <w:t>. El equipo de enfermería que programa los seguimientos tiene una capacidad diaria fija, muy inferior al número de egresos.</w:t>
+        <w:t>Desde una perspectiva operativa, la utilidad del modelo está en apoyar una decisión de priorización antes de que el paciente abandone el hospital. Si la institución dispone de una capacidad limitada para realizar llamadas, controles u otras acciones de seguimiento, una estimación comparable de riesgo permite ordenar los egresos y concentrar primero esos recursos en los pacientes con mayor probabilidad estimada de reingreso.</w:t>
       </w:r>
     </w:p>
     <w:p>
@@ -104,7 +90,7 @@
           <w:b w:val="0"/>
           <w:i w:val="0"/>
         </w:rPr>
-        <w:t xml:space="preserve">Hoy, sin una estimación de riesgo, esa priorización se hace por criterio clínico individual y por el orden en que van saliendo los pacientes. El resultado es que la capacidad de seguimiento no se asigna necesariamente a quienes más la necesitan, y que nadie mide cuánto riesgo queda sin cubrir. Ese es el vacío que el prototipo busca llenar: no reemplazar el criterio clínico, sino </w:t>
+        <w:t xml:space="preserve">Sin una estimación sistemática de riesgo, la priorización puede depender principalmente del criterio clínico individual y de las condiciones operativas del proceso de alta. En ese escenario, la capacidad de seguimiento no necesariamente se asigna primero a los pacientes con mayor riesgo estimado. Ese es el vacío que el prototipo busca abordar: no reemplazar el criterio clínico, sino </w:t>
       </w:r>
       <w:r>
         <w:rPr>
@@ -118,7 +104,16 @@
           <w:b w:val="0"/>
           <w:i w:val="0"/>
         </w:rPr>
-        <w:t xml:space="preserve"> para que la capacidad disponible se gaste donde más rinde.</w:t>
+        <w:t xml:space="preserve"> para apoyar la asignación de la capacidad disponible hacia los pacientes que podrían requerir mayor seguimiento.</w:t>
+      </w:r>
+    </w:p>
+    <w:p>
+      <w:r>
+        <w:rPr>
+          <w:b w:val="0"/>
+          <w:i w:val="0"/>
+        </w:rPr>
+        <w:t>El modelo propuesto es útil porque transforma información disponible durante la hospitalización —antecedentes de utilización de servicios, características del episodio, diagnósticos, pruebas y tratamiento registrado— en una estimación de riesgo individual. Esa estimación complementa, pero no sustituye, el criterio clínico: el prototipo ordena y prioriza casos para seguimiento; no autoriza altas, no diagnostica la causa del reingreso y no prescribe tratamiento.</w:t>
       </w:r>
     </w:p>
     <w:p>
@@ -156,7 +151,7 @@
           <w:b w:val="0"/>
           <w:i w:val="0"/>
         </w:rPr>
-        <w:t>El prototipo trabaja de dos maneras. Sobre el listado completo de egresos del día, ordenándolo por probabilidad estimada y cortando donde se agota la capacidad declarada; y sobre un paciente consultado individualmente. Se descartaron dos versiones más estrechas: una que solo evaluara pacientes de a uno respondería si este paciente reingresa, pero no a quién alcanza a cubrirse, que es la decisión real; y una que solo trabajara por listado dejaría por fuera al paciente que no venía programado.</w:t>
+        <w:t>El prototipo contempla dos formas complementarias de uso. La primera trabaja sobre el listado completo de egresos del día, ordenando a los pacientes según su probabilidad estimada de reingreso y permitiendo priorizar el seguimiento de acuerdo con la capacidad disponible. La segunda permite consultar individualmente a un paciente. Durante el diseño se descartaron dos alternativas más limitadas: una basada únicamente en consultas individuales, porque no permitiría establecer a quién priorizar cuando la capacidad de seguimiento es limitada; y otra basada únicamente en el listado diario, porque no permitiría evaluar un caso particular que requiera una consulta independiente.</w:t>
       </w:r>
     </w:p>
     <w:p>
@@ -172,7 +167,7 @@
           <w:b w:val="0"/>
           <w:i w:val="0"/>
         </w:rPr>
-        <w:t xml:space="preserve"> El prototipo no estima la causa del reingreso ni sugiere tratamiento. No se conecta a un sistema de información hospitalario: el listado de egresos entra como archivo. No reemplaza el criterio clínico —ordena una lista, no autoriza altas—. Y las variables de etnia y aseguradora no entran al modelo: se reservan para auditar si el tablero detecta peor a unos grupos que a otros, porque si entraran podría terminar priorizando por aseguradora en vez de por riesgo clínico.</w:t>
+        <w:t xml:space="preserve"> El prototipo no estima la causa del reingreso, no sugiere tratamientos y no reemplaza el criterio clínico. Tampoco se conecta directamente a un sistema de información hospitalario: el listado de egresos se carga como archivo. La variable race se reserva para evaluar posteriormente el desempeño del modelo entre grupos y no se utiliza como predictora. De igual forma, payer_code se excluye de las variables predictoras, de acuerdo con las decisiones de preparación definidas a partir de la exploración de los datos.</w:t>
       </w:r>
     </w:p>
     <w:p>
@@ -188,7 +183,7 @@
           <w:b w:val="0"/>
           <w:i w:val="0"/>
         </w:rPr>
-        <w:t xml:space="preserve"> Los registros provienen de 130 hospitales de Estados Unidos entre 1999 y 2008. Lo que se entrega es un prototipo metodológico; llevarlo a una institución colombiana exigiría reentrenar con datos propios.</w:t>
+        <w:t xml:space="preserve"> Los registros corresponden a hospitales de Estados Unidos y cubren el periodo 1999–2008. Por esta razón, los patrones identificados no deben generalizarse automáticamente a una población hospitalaria actual o a una institución colombiana. El resultado de esta entrega debe entenderse como un prototipo metodológico; una implementación en otro contexto requeriría validar su desempeño con datos representativos de la población en la que se pretenda utilizar.</w:t>
       </w:r>
     </w:p>
     <w:p>
@@ -228,7 +223,7 @@
           <w:b w:val="0"/>
           <w:i w:val="0"/>
         </w:rPr>
-        <w:t>El criterio de priorización que fijó el enunciado fue la disponibilidad inmediata de los datos, y este conjunto la cumple sin matices: se descarga directamente, sin registro, sin solicitud institucional y sin acuerdo de uso. Frente a la alternativa de buscar datos de una institución colombiana —que habría exigido trámites de aprobación con plazos incompatibles con ocho semanas— la decisión fue inmediata.</w:t>
+        <w:t>Uno de los criterios considerados para seleccionar el conjunto de datos fue su disponibilidad inmediata. Este conjunto puede descargarse directamente desde UCI y cuenta con documentación pública, lo que permite trabajar con la información desde el inicio del proyecto. Frente a una alternativa que requiriera gestionar acceso institucional o recolectar información primaria, su disponibilidad resulta adecuada para el plazo establecido para el microproyecto (8 semanas).</w:t>
       </w:r>
     </w:p>
     <w:p>
@@ -362,7 +357,7 @@
                 <w:b w:val="0"/>
                 <w:sz w:val="18"/>
               </w:rPr>
-              <w:t>101 766 encuentros × 50 columnas</w:t>
+              <w:t>101.766 encuentros × 50 columnas (47 predictoras, 2 identificadores y 1 objetivo)</w:t>
             </w:r>
           </w:p>
         </w:tc>
@@ -400,7 +395,7 @@
                 <w:b w:val="0"/>
                 <w:sz w:val="18"/>
               </w:rPr>
-              <w:t>71 518 — hay pacientes con varios encuentros</w:t>
+              <w:t>71.518 — hay pacientes con varios encuentros</w:t>
             </w:r>
           </w:p>
         </w:tc>
@@ -538,7 +533,7 @@
           <w:b w:val="0"/>
           <w:i w:val="0"/>
         </w:rPr>
-        <w:t xml:space="preserve"> El campo readmitted trae tres valores. Se binariza a &lt;30 contra el resto, y la decisión merece defensa porque no es la única posible: un reingreso a los ocho meses no es un fallo de la transición del cuidado ni cambia a quién se le agenda control el día del alta. Agrupar &gt;30 con NO mantiene el objetivo alineado con la decisión que el tablero apoya.</w:t>
+        <w:t xml:space="preserve"> El campo readmitted contiene tres valores: &lt;30, &gt;30 y NO. Para responder la pregunta de negocio se construye una variable binaria: positivo cuando readmitted = &lt;30 y negativo cuando readmitted = &gt;30 o NO. Esta decisión no implica que los reingresos posteriores a 30 días carezcan de importancia clínica; simplemente quedan fuera de la ventana temporal que el proyecto busca predecir y priorizar.</w:t>
       </w:r>
     </w:p>
     <w:p>
@@ -554,7 +549,7 @@
           <w:b w:val="0"/>
           <w:i w:val="0"/>
         </w:rPr>
-        <w:t xml:space="preserve"> Las 50 columnas se agrupan en demográficas (edad, sexo, etnia), administrativas (tipo de admisión, destino al egreso, aseguradora, especialidad que da el alta), de utilización previa (consultas ambulatorias, urgencias y hospitalizaciones del año anterior), clínicas (días de estancia, número de diagnósticos, códigos ICD-9, resultados de laboratorio) y farmacológicas (23 columnas, una por medicamento). El repositorio incluye el diccionario completo de las 50 variables, con su tipo y sus valores.</w:t>
+        <w:t xml:space="preserve"> Las variables disponibles se agrupan en demográficas (edad, sexo, etnia), administrativas (tipo de admisión, destino al egreso, aseguradora, especialidad que da el alta), de utilización previa (consultas ambulatorias, urgencias y hospitalizaciones del año anterior), clínicas (días de estancia, número de diagnósticos, códigos ICD-9, resultados de laboratorio) y farmacológicas (23 columnas, una por medicamento). El repositorio incluye el diccionario completo de las 50 variables, con su tipo y sus valores.</w:t>
       </w:r>
     </w:p>
     <w:p>
@@ -595,9 +590,20 @@
           <w:sz w:val="17"/>
         </w:rPr>
         <w:br/>
-        <w:t xml:space="preserve">  32</w:t>
+        <w:t xml:space="preserve">  35</w:t>
         <w:tab/>
         <w:t>katterine2558 &lt;61667956+katterine2558@users.noreply.github.com&gt;</w:t>
+      </w:r>
+      <w:r>
+        <w:rPr>
+          <w:rFonts w:ascii="Consolas" w:hAnsi="Consolas"/>
+          <w:color w:val="595959"/>
+          <w:sz w:val="17"/>
+        </w:rPr>
+        <w:br/>
+        <w:t xml:space="preserve">  4</w:t>
+        <w:tab/>
+        <w:t>camiloard777 &lt;camiloard777@gmail.com&gt;</w:t>
       </w:r>
       <w:r>
         <w:rPr>
@@ -614,7 +620,7 @@
           <w:sz w:val="17"/>
         </w:rPr>
         <w:br/>
-        <w:t>$ git log --oneline --all | wc -l      →  32 commits</w:t>
+        <w:t>$ git log --oneline --all | wc -l      →  39 commits</w:t>
       </w:r>
       <w:r>
         <w:rPr>
@@ -623,21 +629,7 @@
           <w:sz w:val="17"/>
         </w:rPr>
         <w:br/>
-        <w:t>$ git branch                           →  develop, feature/exploracion-datos, feature/repo-publico, feature/reporte-urls, main</w:t>
-      </w:r>
-    </w:p>
-    <w:p>
-      <w:pPr>
-        <w:ind w:left="227"/>
-      </w:pPr>
-      <w:r>
-        <w:rPr>
-          <w:b w:val="0"/>
-          <w:i/>
-          <w:color w:val="993300"/>
-          <w:sz w:val="20"/>
-        </w:rPr>
-        <w:t>PENDIENTE — este bloque es hoy el punto débil de la entrega: el historial registra un solo autor. La nota es individual y se sustenta en los commits, así que antes del envío cada integrante debe tener commits propios. Regenerar este documento después para que la salida del comando lo refleje.</w:t>
+        <w:t>$ git branch                           →  develop</w:t>
       </w:r>
     </w:p>
     <w:p>
@@ -817,7 +809,7 @@
           <w:b w:val="0"/>
           <w:i w:val="0"/>
         </w:rPr>
-        <w:t>, y eso es información clínica. Que a un paciente diabético no le midan la hemoglobina glicosilada durante la hospitalización dice algo sobre cómo se manejó su caso, y es justamente la hipótesis del artículo original. Tratarlo como dato ausente e imputarlo destruiría 84 748 observaciones válidas.</w:t>
+        <w:t>, y eso es información clínica. Que a un paciente diabético no le midan la hemoglobina glicosilada durante la hospitalización dice algo sobre cómo se manejó su caso, y es justamente la hipótesis del artículo original. Tratarlo como dato ausente e imputarlo destruiría 84.748 observaciones válidas.</w:t>
       </w:r>
     </w:p>
     <w:tbl>
@@ -942,7 +934,7 @@
                 <w:b w:val="0"/>
                 <w:sz w:val="18"/>
               </w:rPr>
-              <w:t>2 273 valores ? (2,2 %)</w:t>
+              <w:t>2.273 valores ? (2,2 %)</w:t>
             </w:r>
           </w:p>
         </w:tc>
@@ -998,7 +990,7 @@
                 <w:b w:val="0"/>
                 <w:sz w:val="18"/>
               </w:rPr>
-              <w:t>98 569 valores ? (96,9 %)</w:t>
+              <w:t>98.569 valores ? (96,9 %)</w:t>
             </w:r>
           </w:p>
         </w:tc>
@@ -1092,7 +1084,7 @@
                 <w:b w:val="0"/>
                 <w:sz w:val="18"/>
               </w:rPr>
-              <w:t>84 748 nulos</w:t>
+              <w:t>84.748 nulos</w:t>
             </w:r>
           </w:p>
         </w:tc>
@@ -1148,7 +1140,7 @@
                 <w:b w:val="0"/>
                 <w:sz w:val="18"/>
               </w:rPr>
-              <w:t>96 420 nulos</w:t>
+              <w:t>96.420 nulos</w:t>
             </w:r>
           </w:p>
         </w:tc>
@@ -1207,7 +1199,7 @@
           <w:b w:val="0"/>
           <w:i w:val="0"/>
         </w:rPr>
-        <w:t>El destino al egreso identifica encuentros que no deben entrar al análisis, por razones que conviene no confundir. Los 1 652 encuentros de pacientes fallecidos no pueden reingresar, y los datos lo confirman: ninguno registra reingreso. Excluirlos corrige un imposible. Los 771 con egreso a hospicio sí reingresan —43 lo hacen antes de los 30 días— y se excluyen por una razón distinta: son pacientes en cuidado de fin de vida, donde agendar un control para evitar el reingreso no es la intervención que el tablero decide.</w:t>
+        <w:t>El destino al egreso identifica encuentros que no deben entrar al análisis, por razones que conviene no confundir. Los 1.652 encuentros de pacientes fallecidos no pueden reingresar, y los datos lo confirman: ninguno registra reingreso. Excluirlos corrige un imposible. Los 771 con egreso a hospicio sí reingresan —43 lo hacen antes de los 30 días— y se excluyen por una razón distinta: son pacientes en cuidado de fin de vida, donde agendar un control para evitar el reingreso no es la intervención que el tablero decide.</w:t>
       </w:r>
     </w:p>
     <w:p>
@@ -1216,14 +1208,14 @@
           <w:b w:val="0"/>
           <w:i w:val="0"/>
         </w:rPr>
-        <w:t xml:space="preserve">En conjunto salen 2 423 encuentros, el 2,38 %. La base de trabajo queda en </w:t>
+        <w:t xml:space="preserve">En conjunto salen 2.423 encuentros, el 2,38 %. La base de trabajo queda en </w:t>
       </w:r>
       <w:r>
         <w:rPr>
           <w:b/>
           <w:i w:val="0"/>
         </w:rPr>
-        <w:t>99 343 egresos</w:t>
+        <w:t>99.343 egresos</w:t>
       </w:r>
       <w:r>
         <w:rPr>
@@ -1260,7 +1252,7 @@
           <w:b w:val="0"/>
           <w:i w:val="0"/>
         </w:rPr>
-        <w:t>, con menos de doce positivos por cada cien casos, la exactitud es una métrica inútil: un modelo que responda siempre «no reingresa» acierta el 88,6 % y no sirve para nada. La evaluación se hará sobre el ordenamiento —precisión en los primeros k casos, que es como se usa realmente— y no sobre una etiqueta.</w:t>
+        <w:t>, con menos de doce reingresos tempranos por cada cien casos, la exactitud utilizada de manera aislada resulta insuficiente para evaluar el desempeño del modelo. Por ejemplo, un modelo que predijera siempre «no reingresa» alcanzaría una exactitud cercana al 88,6 %, aun sin identificar ningún reingreso temprano. Por esta razón, la evaluación deberá considerar métricas que permitan valorar la identificación y priorización de la clase minoritaria.</w:t>
       </w:r>
     </w:p>
     <w:p>
@@ -1331,23 +1323,16 @@
           <w:color w:val="595959"/>
           <w:sz w:val="17"/>
         </w:rPr>
-        <w:t>Figura 1. Tasa de reingreso &lt; 30 días según hospitalizaciones en el año previo. Base: 99 343 egresos tras exclusiones.</w:t>
+        <w:t>Figura 1. Tasa de reingreso &lt; 30 días según hospitalizaciones en el año previo. Base: 99.343 egresos tras exclusiones.</w:t>
       </w:r>
     </w:p>
     <w:p>
       <w:r>
         <w:rPr>
-          <w:b/>
-          <w:i w:val="0"/>
-        </w:rPr>
-        <w:t>Por lo tanto</w:t>
-      </w:r>
-      <w:r>
-        <w:rPr>
           <w:b w:val="0"/>
           <w:i w:val="0"/>
         </w:rPr>
-        <w:t>, number_inpatient y sus columnas hermanas entran al modelo sin discusión, y la maqueta las muestra en el listado junto a la probabilidad para que la enfermera pueda contrastar el puntaje con un dato que entiende.</w:t>
+        <w:t>El patrón observado convierte a number_inpatient y a las demás variables de utilización previa en candidatas relevantes para el modelamiento. Su aporte definitivo deberá confirmarse durante el entrenamiento y la validación del modelo. La maqueta las muestra junto a la probabilidad estimada porque son antecedentes fáciles de interpretar para el usuario.</w:t>
       </w:r>
     </w:p>
     <w:p>
@@ -1478,7 +1463,7 @@
           <w:color w:val="595959"/>
           <w:sz w:val="17"/>
         </w:rPr>
-        <w:t>Figura 3. Tasa de reingreso por grupo de edad. El pico de 20–30 años se apoya en 1 649 registros, frente a más de 20 000 en los grupos mayores.</w:t>
+        <w:t>Figura 3. Tasa de reingreso por grupo de edad. El pico de 20–30 años se apoya en 1.649 registros, frente a más de 20.000 en los grupos mayores.</w:t>
       </w:r>
     </w:p>
     <w:p>
@@ -1501,7 +1486,7 @@
           <w:b w:val="0"/>
           <w:i w:val="0"/>
         </w:rPr>
-        <w:t>, conviene leerlo con reservas: descansa sobre 1 649 registros, un orden de magnitud menos que los grupos mayores, y no justificaría por sí solo una regla de priorización.</w:t>
+        <w:t>, conviene leerlo con reservas: descansa sobre 1.649 registros, un orden de magnitud menos que los grupos mayores, y no justificaría por sí solo una regla de priorización.</w:t>
       </w:r>
     </w:p>
     <w:p>
@@ -1518,7 +1503,7 @@
           <w:b w:val="0"/>
           <w:i w:val="0"/>
         </w:rPr>
-        <w:t xml:space="preserve">Los 99 343 encuentros corresponden a 69 990 pacientes distintos: 16 341 pacientes aparecen más de una vez. </w:t>
+        <w:t xml:space="preserve">Los 99.343 encuentros corresponden a 69.990 pacientes distintos: 16.341 pacientes aparecen más de una vez. </w:t>
       </w:r>
       <w:r>
         <w:rPr>
@@ -1541,7 +1526,7 @@
           <w:b w:val="0"/>
           <w:i w:val="0"/>
         </w:rPr>
-        <w:t>Se detectaron además dos columnas de varianza cero —examide y citoglipton, con un único valor en las 101 766 filas— y otras siete de medicamentos con menos de cincuenta registros distintos de «no recetado». Todas se descartan.</w:t>
+        <w:t>Se detectaron además dos columnas de varianza cero —examide y citoglipton, con un único valor en las 101.766 filas— y otras siete de medicamentos con menos de cincuenta registros distintos de «no recetado». Todas se descartan.</w:t>
       </w:r>
     </w:p>
     <w:p>
@@ -1558,7 +1543,7 @@
           <w:b w:val="0"/>
           <w:i w:val="0"/>
         </w:rPr>
-        <w:t>La maqueta define tres pantallas y trece elementos identificados de E1 a E13. Las cifras que muestra el componente descriptivo son reales, calculadas sobre los 99 343 egresos; los datos de las pantallas de predicción son ilustrativos.</w:t>
+        <w:t>La maqueta define tres pantallas y trece elementos identificados de E1 a E13. Las cifras que muestra el componente descriptivo son reales, calculadas sobre los 99.343 egresos; los datos de las pantallas de predicción son ilustrativos.</w:t>
       </w:r>
     </w:p>
     <w:p>
@@ -2261,20 +2246,6 @@
         <w:t>8. Reporte de trabajo en equipo</w:t>
       </w:r>
     </w:p>
-    <w:p>
-      <w:pPr>
-        <w:ind w:left="227"/>
-      </w:pPr>
-      <w:r>
-        <w:rPr>
-          <w:b w:val="0"/>
-          <w:i/>
-          <w:color w:val="993300"/>
-          <w:sz w:val="20"/>
-        </w:rPr>
-        <w:t>PENDIENTE — esta sección la escribe el equipo y no puede generarse automáticamente. Debe ser consistente con git shortlog: si el reporte dice que alguien lideró la exploración de datos, esa persona debe tener commits del notebook. Conviene cubrir: cómo se repartieron los ítems de trabajo, qué hizo cada integrante, cómo se coordinaron, y qué fechas de entrega y de revisión interna se fijaron.</w:t>
-      </w:r>
-    </w:p>
     <w:tbl>
       <w:tblPr>
         <w:tblStyle w:val="TableGrid"/>
@@ -2283,14 +2254,13 @@
         <w:tblLook w:firstColumn="1" w:firstRow="1" w:lastColumn="0" w:lastRow="0" w:noHBand="0" w:noVBand="1" w:val="04A0"/>
       </w:tblPr>
       <w:tblGrid>
-        <w:gridCol w:w="3137"/>
-        <w:gridCol w:w="3137"/>
-        <w:gridCol w:w="3137"/>
+        <w:gridCol w:w="4706"/>
+        <w:gridCol w:w="4706"/>
       </w:tblGrid>
       <w:tr>
         <w:tc>
           <w:tcPr>
-            <w:tcW w:type="dxa" w:w="2494"/>
+            <w:tcW w:type="dxa" w:w="5953"/>
             <w:shd w:fill="EFEFEC"/>
           </w:tcPr>
           <w:p>
@@ -2303,13 +2273,13 @@
                 <w:b/>
                 <w:sz w:val="18"/>
               </w:rPr>
-              <w:t>Integrante</w:t>
+              <w:t>Actividad</w:t>
             </w:r>
           </w:p>
         </w:tc>
         <w:tc>
           <w:tcPr>
-            <w:tcW w:type="dxa" w:w="4082"/>
+            <w:tcW w:type="dxa" w:w="3458"/>
             <w:shd w:fill="EFEFEC"/>
           </w:tcPr>
           <w:p>
@@ -2322,14 +2292,15 @@
                 <w:b/>
                 <w:sz w:val="18"/>
               </w:rPr>
-              <w:t>Ítems de trabajo</w:t>
+              <w:t>Responsable</w:t>
             </w:r>
           </w:p>
         </w:tc>
+      </w:tr>
+      <w:tr>
         <w:tc>
           <w:tcPr>
-            <w:tcW w:type="dxa" w:w="2835"/>
-            <w:shd w:fill="EFEFEC"/>
+            <w:tcW w:type="dxa" w:w="5953"/>
           </w:tcPr>
           <w:p>
             <w:pPr>
@@ -2338,10 +2309,28 @@
             <w:r/>
             <w:r>
               <w:rPr>
-                <w:b/>
+                <w:b w:val="0"/>
                 <w:sz w:val="18"/>
               </w:rPr>
-              <w:t>Evidencia en commits</w:t>
+              <w:t>Problema y contexto</w:t>
+            </w:r>
+          </w:p>
+        </w:tc>
+        <w:tc>
+          <w:tcPr>
+            <w:tcW w:type="dxa" w:w="3458"/>
+          </w:tcPr>
+          <w:p>
+            <w:pPr>
+              <w:spacing w:after="40"/>
+            </w:pPr>
+            <w:r/>
+            <w:r>
+              <w:rPr>
+                <w:b w:val="0"/>
+                <w:sz w:val="18"/>
+              </w:rPr>
+              <w:t>Todos</w:t>
             </w:r>
           </w:p>
         </w:tc>
@@ -2349,140 +2338,228 @@
       <w:tr>
         <w:tc>
           <w:tcPr>
-            <w:tcW w:type="dxa" w:w="2494"/>
+            <w:tcW w:type="dxa" w:w="5953"/>
           </w:tcPr>
           <w:p>
             <w:pPr>
               <w:spacing w:after="40"/>
             </w:pPr>
             <w:r/>
+            <w:r>
+              <w:rPr>
+                <w:b w:val="0"/>
+                <w:sz w:val="18"/>
+              </w:rPr>
+              <w:t>Pregunta de negocio y alcance</w:t>
+            </w:r>
           </w:p>
         </w:tc>
         <w:tc>
           <w:tcPr>
-            <w:tcW w:type="dxa" w:w="4082"/>
+            <w:tcW w:type="dxa" w:w="3458"/>
           </w:tcPr>
           <w:p>
             <w:pPr>
               <w:spacing w:after="40"/>
             </w:pPr>
             <w:r/>
+            <w:r>
+              <w:rPr>
+                <w:b w:val="0"/>
+                <w:sz w:val="18"/>
+              </w:rPr>
+              <w:t>Todos</w:t>
+            </w:r>
           </w:p>
         </w:tc>
+      </w:tr>
+      <w:tr>
         <w:tc>
           <w:tcPr>
-            <w:tcW w:type="dxa" w:w="2835"/>
+            <w:tcW w:type="dxa" w:w="5953"/>
           </w:tcPr>
           <w:p>
             <w:pPr>
               <w:spacing w:after="40"/>
             </w:pPr>
             <w:r/>
+            <w:r>
+              <w:rPr>
+                <w:b w:val="0"/>
+                <w:sz w:val="18"/>
+              </w:rPr>
+              <w:t>Descripción del conjunto de datos</w:t>
+            </w:r>
+          </w:p>
+        </w:tc>
+        <w:tc>
+          <w:tcPr>
+            <w:tcW w:type="dxa" w:w="3458"/>
+          </w:tcPr>
+          <w:p>
+            <w:pPr>
+              <w:spacing w:after="40"/>
+            </w:pPr>
+            <w:r/>
+            <w:r>
+              <w:rPr>
+                <w:b w:val="0"/>
+                <w:sz w:val="18"/>
+              </w:rPr>
+              <w:t>Gineth Katerine Arias Carrillo</w:t>
+            </w:r>
           </w:p>
         </w:tc>
       </w:tr>
       <w:tr>
         <w:tc>
           <w:tcPr>
-            <w:tcW w:type="dxa" w:w="2494"/>
+            <w:tcW w:type="dxa" w:w="5953"/>
           </w:tcPr>
           <w:p>
             <w:pPr>
               <w:spacing w:after="40"/>
             </w:pPr>
             <w:r/>
+            <w:r>
+              <w:rPr>
+                <w:b w:val="0"/>
+                <w:sz w:val="18"/>
+              </w:rPr>
+              <w:t>Exploración de los datos</w:t>
+            </w:r>
           </w:p>
         </w:tc>
         <w:tc>
           <w:tcPr>
-            <w:tcW w:type="dxa" w:w="4082"/>
+            <w:tcW w:type="dxa" w:w="3458"/>
           </w:tcPr>
           <w:p>
             <w:pPr>
               <w:spacing w:after="40"/>
             </w:pPr>
             <w:r/>
+            <w:r>
+              <w:rPr>
+                <w:b w:val="0"/>
+                <w:sz w:val="18"/>
+              </w:rPr>
+              <w:t>Gineth Katerine Arias Carrillo</w:t>
+            </w:r>
           </w:p>
         </w:tc>
+      </w:tr>
+      <w:tr>
         <w:tc>
           <w:tcPr>
-            <w:tcW w:type="dxa" w:w="2835"/>
+            <w:tcW w:type="dxa" w:w="5953"/>
           </w:tcPr>
           <w:p>
             <w:pPr>
               <w:spacing w:after="40"/>
             </w:pPr>
             <w:r/>
+            <w:r>
+              <w:rPr>
+                <w:b w:val="0"/>
+                <w:sz w:val="18"/>
+              </w:rPr>
+              <w:t>Maqueta del prototipo</w:t>
+            </w:r>
+          </w:p>
+        </w:tc>
+        <w:tc>
+          <w:tcPr>
+            <w:tcW w:type="dxa" w:w="3458"/>
+          </w:tcPr>
+          <w:p>
+            <w:pPr>
+              <w:spacing w:after="40"/>
+            </w:pPr>
+            <w:r/>
+            <w:r>
+              <w:rPr>
+                <w:b w:val="0"/>
+                <w:sz w:val="18"/>
+              </w:rPr>
+              <w:t>Gineth Katerine Arias Carrillo, Jasbyn Rainier Solano Carrillo</w:t>
+            </w:r>
           </w:p>
         </w:tc>
       </w:tr>
       <w:tr>
         <w:tc>
           <w:tcPr>
-            <w:tcW w:type="dxa" w:w="2494"/>
+            <w:tcW w:type="dxa" w:w="5953"/>
           </w:tcPr>
           <w:p>
             <w:pPr>
               <w:spacing w:after="40"/>
             </w:pPr>
             <w:r/>
+            <w:r>
+              <w:rPr>
+                <w:b w:val="0"/>
+                <w:sz w:val="18"/>
+              </w:rPr>
+              <w:t>Repositorios creados</w:t>
+            </w:r>
           </w:p>
         </w:tc>
         <w:tc>
           <w:tcPr>
-            <w:tcW w:type="dxa" w:w="4082"/>
+            <w:tcW w:type="dxa" w:w="3458"/>
           </w:tcPr>
           <w:p>
             <w:pPr>
               <w:spacing w:after="40"/>
             </w:pPr>
             <w:r/>
+            <w:r>
+              <w:rPr>
+                <w:b w:val="0"/>
+                <w:sz w:val="18"/>
+              </w:rPr>
+              <w:t>Gineth Katerine Arias Carrillo</w:t>
+            </w:r>
           </w:p>
         </w:tc>
+      </w:tr>
+      <w:tr>
         <w:tc>
           <w:tcPr>
-            <w:tcW w:type="dxa" w:w="2835"/>
+            <w:tcW w:type="dxa" w:w="5953"/>
           </w:tcPr>
           <w:p>
             <w:pPr>
               <w:spacing w:after="40"/>
             </w:pPr>
             <w:r/>
+            <w:r>
+              <w:rPr>
+                <w:b w:val="0"/>
+                <w:sz w:val="18"/>
+              </w:rPr>
+              <w:t>Revisión y ajuste del reporte</w:t>
+            </w:r>
           </w:p>
         </w:tc>
-      </w:tr>
-      <w:tr>
         <w:tc>
           <w:tcPr>
-            <w:tcW w:type="dxa" w:w="2494"/>
+            <w:tcW w:type="dxa" w:w="3458"/>
           </w:tcPr>
           <w:p>
             <w:pPr>
               <w:spacing w:after="40"/>
             </w:pPr>
             <w:r/>
-          </w:p>
-        </w:tc>
-        <w:tc>
-          <w:tcPr>
-            <w:tcW w:type="dxa" w:w="4082"/>
-          </w:tcPr>
-          <w:p>
-            <w:pPr>
-              <w:spacing w:after="40"/>
-            </w:pPr>
-            <w:r/>
-          </w:p>
-        </w:tc>
-        <w:tc>
-          <w:tcPr>
-            <w:tcW w:type="dxa" w:w="2835"/>
-          </w:tcPr>
-          <w:p>
-            <w:pPr>
-              <w:spacing w:after="40"/>
-            </w:pPr>
-            <w:r/>
+            <w:r>
+              <w:rPr>
+                <w:b w:val="0"/>
+                <w:sz w:val="18"/>
+              </w:rPr>
+              <w:t>Camilo Rodríguez Dueñas</w:t>
+            </w:r>
           </w:p>
         </w:tc>
       </w:tr>
@@ -2497,7 +2574,35 @@
         <w:pStyle w:val="Heading1"/>
       </w:pPr>
       <w:r>
-        <w:t>Soportes adjuntos</w:t>
+        <w:t>9. Referencias</w:t>
+      </w:r>
+    </w:p>
+    <w:p>
+      <w:r>
+        <w:rPr>
+          <w:b w:val="0"/>
+          <w:i w:val="0"/>
+          <w:sz w:val="19"/>
+        </w:rPr>
+        <w:t>Clore, J., Cios, K., DeShazo, J., &amp; Strack, B. (2014). Diabetes 130-US Hospitals for Years 1999-2008 [Dataset]. UCI Machine Learning Repository. https://doi.org/10.24432/C5230J</w:t>
+      </w:r>
+    </w:p>
+    <w:p>
+      <w:r>
+        <w:rPr>
+          <w:b w:val="0"/>
+          <w:i w:val="0"/>
+          <w:sz w:val="19"/>
+        </w:rPr>
+        <w:t>Strack, B., DeShazo, J. P., Gennings, C., Olmo, J. L., Ventura, S., Cios, K. J., &amp; Clore, J. N. (2014). Impact of HbA1c measurement on hospital readmission rates: Analysis of 70,000 clinical database patient records. BioMed Research International, 2014, Article 781670. https://doi.org/10.1155/2014/781670</w:t>
+      </w:r>
+    </w:p>
+    <w:p>
+      <w:pPr>
+        <w:pStyle w:val="Heading1"/>
+      </w:pPr>
+      <w:r>
+        <w:t>Soportes de la entrega</w:t>
       </w:r>
     </w:p>
     <w:p>

</xml_diff>

<commit_message>
infra delivery baseline arq
</commit_message>
<xml_diff>
--- a/docs/entregas/Entrega-1-reporte.docx
+++ b/docs/entregas/Entrega-1-reporte.docx
@@ -612,6 +612,9 @@
           <w:sz w:val="17"/>
         </w:rPr>
         <w:br/>
+        <w:t xml:space="preserve">  2</w:t>
+        <w:tab/>
+        <w:t>Rai Solano &lt;raisolanoapps@gmail.com&gt;</w:t>
       </w:r>
       <w:r>
         <w:rPr>
@@ -620,7 +623,9 @@
           <w:sz w:val="17"/>
         </w:rPr>
         <w:br/>
-        <w:t>$ git log --oneline --all | wc -l      →  39 commits</w:t>
+        <w:t xml:space="preserve">  1</w:t>
+        <w:tab/>
+        <w:t>Camilo Andres Rodriguez &lt;camiloard777@gmail.com&gt;</w:t>
       </w:r>
       <w:r>
         <w:rPr>
@@ -629,7 +634,24 @@
           <w:sz w:val="17"/>
         </w:rPr>
         <w:br/>
-        <w:t>$ git branch                           →  develop</w:t>
+      </w:r>
+      <w:r>
+        <w:rPr>
+          <w:rFonts w:ascii="Consolas" w:hAnsi="Consolas"/>
+          <w:color w:val="595959"/>
+          <w:sz w:val="17"/>
+        </w:rPr>
+        <w:br/>
+        <w:t>$ git log --oneline --all | wc -l      →  42 commits</w:t>
+      </w:r>
+      <w:r>
+        <w:rPr>
+          <w:rFonts w:ascii="Consolas" w:hAnsi="Consolas"/>
+          <w:color w:val="595959"/>
+          <w:sz w:val="17"/>
+        </w:rPr>
+        <w:br/>
+        <w:t>$ git branch                           →  develop, feature/infra-delivery-baseline-arq</w:t>
       </w:r>
     </w:p>
     <w:p>
@@ -2563,6 +2585,44 @@
           </w:p>
         </w:tc>
       </w:tr>
+      <w:tr>
+        <w:tc>
+          <w:tcPr>
+            <w:tcW w:type="dxa" w:w="5953"/>
+          </w:tcPr>
+          <w:p>
+            <w:pPr>
+              <w:spacing w:after="40"/>
+            </w:pPr>
+            <w:r/>
+            <w:r>
+              <w:rPr>
+                <w:b w:val="0"/>
+                <w:sz w:val="18"/>
+              </w:rPr>
+              <w:t>Propuesta diseño arquitectura infraestructura</w:t>
+            </w:r>
+          </w:p>
+        </w:tc>
+        <w:tc>
+          <w:tcPr>
+            <w:tcW w:type="dxa" w:w="3458"/>
+          </w:tcPr>
+          <w:p>
+            <w:pPr>
+              <w:spacing w:after="40"/>
+            </w:pPr>
+            <w:r/>
+            <w:r>
+              <w:rPr>
+                <w:b w:val="0"/>
+                <w:sz w:val="18"/>
+              </w:rPr>
+              <w:t>Jasbyn Rainier Solano Carrillo</w:t>
+            </w:r>
+          </w:p>
+        </w:tc>
+      </w:tr>
     </w:tbl>
     <w:p>
       <w:pPr>
@@ -2723,6 +2783,18 @@
           <w:i w:val="0"/>
         </w:rPr>
         <w:t>Política IAM del remoto de datos: https://github.com/katterine2558/microproyecto-desarrollo-soluciones/blob/main/docs/soportes/politica-iam-dvc.json</w:t>
+      </w:r>
+    </w:p>
+    <w:p>
+      <w:pPr>
+        <w:pStyle w:val="ListBullet"/>
+      </w:pPr>
+      <w:r>
+        <w:rPr>
+          <w:b w:val="0"/>
+          <w:i w:val="0"/>
+        </w:rPr>
+        <w:t>Propuesta diseño arquitectura infraestructura: https://github.com/katterine2558/microproyecto-desarrollo-soluciones/blob/main/docs/soportes/arquitectura/INFRA-V-0.0.1.md</w:t>
       </w:r>
     </w:p>
     <w:sectPr>

</xml_diff>